<commit_message>
Remove obsolete dissertation files and add new Cyber2U dissertation document
</commit_message>
<xml_diff>
--- a/contribution log indivdual project.docx
+++ b/contribution log indivdual project.docx
@@ -4452,6 +4452,406 @@
                 <w:szCs w:val="26"/>
               </w:rPr>
               <w:t>It was difficult to provide precise data synchronisation between various components (quiz system, email interactions, and analytics tracking). To confirm data integrity, more testing was necessary. Another major problem continued to be striking a balance between feature development and final evaluation and reporting preparation.</w:t>
+            </w:r>
+          </w:p>
+        </w:tc>
+      </w:tr>
+    </w:tbl>
+    <w:p/>
+    <w:tbl>
+      <w:tblPr>
+        <w:tblStyle w:val="TableGrid"/>
+        <w:tblW w:type="auto" w:w="0"/>
+        <w:tblLook w:firstColumn="1" w:firstRow="1" w:lastColumn="0" w:lastRow="0" w:noHBand="0" w:noVBand="1" w:val="04A0"/>
+      </w:tblPr>
+      <w:tblGrid>
+        <w:gridCol w:w="4513"/>
+        <w:gridCol w:w="4513"/>
+      </w:tblGrid>
+      <w:tr>
+        <w:tc>
+          <w:tcPr>
+            <w:tcW w:type="dxa" w:w="4513"/>
+          </w:tcPr>
+          <w:p>
+            <w:r>
+              <w:t>Week 23</w:t>
+            </w:r>
+          </w:p>
+        </w:tc>
+        <w:tc>
+          <w:tcPr>
+            <w:tcW w:type="dxa" w:w="4513"/>
+          </w:tcPr>
+          <w:p>
+            <w:r>
+              <w:t>Date: 2nd March 2026</w:t>
+            </w:r>
+          </w:p>
+        </w:tc>
+      </w:tr>
+      <w:tr>
+        <w:tc>
+          <w:tcPr>
+            <w:tcW w:type="dxa" w:w="4513"/>
+          </w:tcPr>
+          <w:p>
+            <w:r>
+              <w:t>Deliverables:</w:t>
+            </w:r>
+          </w:p>
+        </w:tc>
+        <w:tc>
+          <w:tcPr>
+            <w:tcW w:type="dxa" w:w="4513"/>
+          </w:tcPr>
+          <w:p>
+            <w:r>
+              <w:t>Implemented authentication hardening and user session reliability improvements | Refined quiz flow and progress persistence between pages | Added dissertation evidence screenshots and architecture notes for implementation chapter</w:t>
+            </w:r>
+          </w:p>
+        </w:tc>
+      </w:tr>
+      <w:tr>
+        <w:tc>
+          <w:tcPr>
+            <w:tcW w:type="dxa" w:w="4513"/>
+          </w:tcPr>
+          <w:p>
+            <w:r>
+              <w:t>Description:</w:t>
+            </w:r>
+          </w:p>
+        </w:tc>
+        <w:tc>
+          <w:tcPr>
+            <w:tcW w:type="dxa" w:w="4513"/>
+          </w:tcPr>
+          <w:p>
+            <w:r>
+              <w:t>This week focused on stabilising the production flow of the Cyber2U app. I improved authentication handling around magic-link access and session continuity so demo users and normal users could complete the learning journey without re-authentication issues. Quiz-to-dashboard data flow was validated end-to-end, including persistence of progress records and status updates. In parallel, I captured implementation evidence and integrated these into the dissertation draft to support the Design and Implementation chapter.</w:t>
+            </w:r>
+          </w:p>
+        </w:tc>
+      </w:tr>
+      <w:tr>
+        <w:tc>
+          <w:tcPr>
+            <w:tcW w:type="dxa" w:w="4513"/>
+          </w:tcPr>
+          <w:p>
+            <w:r>
+              <w:t>Challenges, technical issues and/or project management issues:</w:t>
+            </w:r>
+          </w:p>
+        </w:tc>
+        <w:tc>
+          <w:tcPr>
+            <w:tcW w:type="dxa" w:w="4513"/>
+          </w:tcPr>
+          <w:p>
+            <w:r>
+              <w:t>The main challenge was aligning front-end state with backend progress records after navigation and refresh events. I resolved this through additional integration checks and endpoint validation, but it required iterative debugging to prevent regressions while documenting reproducible evidence for the dissertation.</w:t>
+            </w:r>
+          </w:p>
+        </w:tc>
+      </w:tr>
+    </w:tbl>
+    <w:p/>
+    <w:tbl>
+      <w:tblPr>
+        <w:tblStyle w:val="TableGrid"/>
+        <w:tblW w:type="auto" w:w="0"/>
+        <w:tblLook w:firstColumn="1" w:firstRow="1" w:lastColumn="0" w:lastRow="0" w:noHBand="0" w:noVBand="1" w:val="04A0"/>
+      </w:tblPr>
+      <w:tblGrid>
+        <w:gridCol w:w="4513"/>
+        <w:gridCol w:w="4513"/>
+      </w:tblGrid>
+      <w:tr>
+        <w:tc>
+          <w:tcPr>
+            <w:tcW w:type="dxa" w:w="4513"/>
+          </w:tcPr>
+          <w:p>
+            <w:r>
+              <w:t>Week 24</w:t>
+            </w:r>
+          </w:p>
+        </w:tc>
+        <w:tc>
+          <w:tcPr>
+            <w:tcW w:type="dxa" w:w="4513"/>
+          </w:tcPr>
+          <w:p>
+            <w:r>
+              <w:t>Date: 9th March 2026</w:t>
+            </w:r>
+          </w:p>
+        </w:tc>
+      </w:tr>
+      <w:tr>
+        <w:tc>
+          <w:tcPr>
+            <w:tcW w:type="dxa" w:w="4513"/>
+          </w:tcPr>
+          <w:p>
+            <w:r>
+              <w:t>Deliverables:</w:t>
+            </w:r>
+          </w:p>
+        </w:tc>
+        <w:tc>
+          <w:tcPr>
+            <w:tcW w:type="dxa" w:w="4513"/>
+          </w:tcPr>
+          <w:p>
+            <w:r>
+              <w:t>Expanded analytics and reporting outputs for campaign and learner behaviour | Completed test runs for key user journeys and fixed identified defects | Drafted Evaluation chapter subsections using latest app metrics and observations</w:t>
+            </w:r>
+          </w:p>
+        </w:tc>
+      </w:tr>
+      <w:tr>
+        <w:tc>
+          <w:tcPr>
+            <w:tcW w:type="dxa" w:w="4513"/>
+          </w:tcPr>
+          <w:p>
+            <w:r>
+              <w:t>Description:</w:t>
+            </w:r>
+          </w:p>
+        </w:tc>
+        <w:tc>
+          <w:tcPr>
+            <w:tcW w:type="dxa" w:w="4513"/>
+          </w:tcPr>
+          <w:p>
+            <w:r>
+              <w:t>Work this week centred on quality assurance and measurable outcomes. I tested core flows including signup, magic-link verification, quiz play, progress tracking, and admin analytics views, then corrected issues affecting continuity of analytics records. The analytics outputs were then used to populate dissertation evaluation material, linking implementation behaviour to project objectives and behavioural-change expectations.</w:t>
+            </w:r>
+          </w:p>
+        </w:tc>
+      </w:tr>
+      <w:tr>
+        <w:tc>
+          <w:tcPr>
+            <w:tcW w:type="dxa" w:w="4513"/>
+          </w:tcPr>
+          <w:p>
+            <w:r>
+              <w:t>Challenges, technical issues and/or project management issues:</w:t>
+            </w:r>
+          </w:p>
+        </w:tc>
+        <w:tc>
+          <w:tcPr>
+            <w:tcW w:type="dxa" w:w="4513"/>
+          </w:tcPr>
+          <w:p>
+            <w:r>
+              <w:t>Interpreting metrics required careful filtering because pilot-style usage can produce uneven data density. I addressed this by cross-checking multiple data points and documenting assumptions clearly so the dissertation evaluation remains transparent and defensible.</w:t>
+            </w:r>
+          </w:p>
+        </w:tc>
+      </w:tr>
+    </w:tbl>
+    <w:p/>
+    <w:tbl>
+      <w:tblPr>
+        <w:tblStyle w:val="TableGrid"/>
+        <w:tblW w:type="auto" w:w="0"/>
+        <w:tblLook w:firstColumn="1" w:firstRow="1" w:lastColumn="0" w:lastRow="0" w:noHBand="0" w:noVBand="1" w:val="04A0"/>
+      </w:tblPr>
+      <w:tblGrid>
+        <w:gridCol w:w="4513"/>
+        <w:gridCol w:w="4513"/>
+      </w:tblGrid>
+      <w:tr>
+        <w:tc>
+          <w:tcPr>
+            <w:tcW w:type="dxa" w:w="4513"/>
+          </w:tcPr>
+          <w:p>
+            <w:r>
+              <w:t>Week 25</w:t>
+            </w:r>
+          </w:p>
+        </w:tc>
+        <w:tc>
+          <w:tcPr>
+            <w:tcW w:type="dxa" w:w="4513"/>
+          </w:tcPr>
+          <w:p>
+            <w:r>
+              <w:t>Date: 16th March 2026</w:t>
+            </w:r>
+          </w:p>
+        </w:tc>
+      </w:tr>
+      <w:tr>
+        <w:tc>
+          <w:tcPr>
+            <w:tcW w:type="dxa" w:w="4513"/>
+          </w:tcPr>
+          <w:p>
+            <w:r>
+              <w:t>Deliverables:</w:t>
+            </w:r>
+          </w:p>
+        </w:tc>
+        <w:tc>
+          <w:tcPr>
+            <w:tcW w:type="dxa" w:w="4513"/>
+          </w:tcPr>
+          <w:p>
+            <w:r>
+              <w:t>Finalised dissertation implementation details with updated system diagrams and feature descriptions | Performed final pass on frontend usability refinements and content clarity | Consolidated references, appendices, and contribution evidence in line with project milestones</w:t>
+            </w:r>
+          </w:p>
+        </w:tc>
+      </w:tr>
+      <w:tr>
+        <w:tc>
+          <w:tcPr>
+            <w:tcW w:type="dxa" w:w="4513"/>
+          </w:tcPr>
+          <w:p>
+            <w:r>
+              <w:t>Description:</w:t>
+            </w:r>
+          </w:p>
+        </w:tc>
+        <w:tc>
+          <w:tcPr>
+            <w:tcW w:type="dxa" w:w="4513"/>
+          </w:tcPr>
+          <w:p>
+            <w:r>
+              <w:t>This week moved from feature completion to final consolidation. The Cyber2U app was refined for presentation readiness, with improvements to text clarity, flow consistency, and usability across learner and admin screens. I updated system and data-flow descriptions in the dissertation so they accurately reflect the implemented architecture and current functionality.</w:t>
+            </w:r>
+          </w:p>
+        </w:tc>
+      </w:tr>
+      <w:tr>
+        <w:tc>
+          <w:tcPr>
+            <w:tcW w:type="dxa" w:w="4513"/>
+          </w:tcPr>
+          <w:p>
+            <w:r>
+              <w:t>Challenges, technical issues and/or project management issues:</w:t>
+            </w:r>
+          </w:p>
+        </w:tc>
+        <w:tc>
+          <w:tcPr>
+            <w:tcW w:type="dxa" w:w="4513"/>
+          </w:tcPr>
+          <w:p>
+            <w:r>
+              <w:t>The key challenge was synchronising final technical updates with dissertation writing without introducing inconsistencies between the live application and report content. This required repeated cross-checking of terminology, screenshots, and chapter claims.</w:t>
+            </w:r>
+          </w:p>
+        </w:tc>
+      </w:tr>
+    </w:tbl>
+    <w:p/>
+    <w:tbl>
+      <w:tblPr>
+        <w:tblStyle w:val="TableGrid"/>
+        <w:tblW w:type="auto" w:w="0"/>
+        <w:tblLook w:firstColumn="1" w:firstRow="1" w:lastColumn="0" w:lastRow="0" w:noHBand="0" w:noVBand="1" w:val="04A0"/>
+      </w:tblPr>
+      <w:tblGrid>
+        <w:gridCol w:w="4513"/>
+        <w:gridCol w:w="4513"/>
+      </w:tblGrid>
+      <w:tr>
+        <w:tc>
+          <w:tcPr>
+            <w:tcW w:type="dxa" w:w="4513"/>
+          </w:tcPr>
+          <w:p>
+            <w:r>
+              <w:t>Week 26</w:t>
+            </w:r>
+          </w:p>
+        </w:tc>
+        <w:tc>
+          <w:tcPr>
+            <w:tcW w:type="dxa" w:w="4513"/>
+          </w:tcPr>
+          <w:p>
+            <w:r>
+              <w:t>Date: 23rd March 2026</w:t>
+            </w:r>
+          </w:p>
+        </w:tc>
+      </w:tr>
+      <w:tr>
+        <w:tc>
+          <w:tcPr>
+            <w:tcW w:type="dxa" w:w="4513"/>
+          </w:tcPr>
+          <w:p>
+            <w:r>
+              <w:t>Deliverables:</w:t>
+            </w:r>
+          </w:p>
+        </w:tc>
+        <w:tc>
+          <w:tcPr>
+            <w:tcW w:type="dxa" w:w="4513"/>
+          </w:tcPr>
+          <w:p>
+            <w:r>
+              <w:t>Completed final Cyber2U dissertation build and quality review | Verified app functionality against documented claims and prepared final demonstration narrative | Finalised contribution log and submission package assets</w:t>
+            </w:r>
+          </w:p>
+        </w:tc>
+      </w:tr>
+      <w:tr>
+        <w:tc>
+          <w:tcPr>
+            <w:tcW w:type="dxa" w:w="4513"/>
+          </w:tcPr>
+          <w:p>
+            <w:r>
+              <w:t>Description:</w:t>
+            </w:r>
+          </w:p>
+        </w:tc>
+        <w:tc>
+          <w:tcPr>
+            <w:tcW w:type="dxa" w:w="4513"/>
+          </w:tcPr>
+          <w:p>
+            <w:r>
+              <w:t>During this final week, I completed the full dissertation build for submission, ensuring every chapter reflects the final Cyber2U implementation state. I performed a final verification sweep of core app behaviour, including authentication, quiz lifecycle, progress capture, and analytics visibility, and aligned this with report discussion, conclusions, and limitations.</w:t>
+            </w:r>
+          </w:p>
+        </w:tc>
+      </w:tr>
+      <w:tr>
+        <w:tc>
+          <w:tcPr>
+            <w:tcW w:type="dxa" w:w="4513"/>
+          </w:tcPr>
+          <w:p>
+            <w:r>
+              <w:t>Challenges, technical issues and/or project management issues:</w:t>
+            </w:r>
+          </w:p>
+        </w:tc>
+        <w:tc>
+          <w:tcPr>
+            <w:tcW w:type="dxa" w:w="4513"/>
+          </w:tcPr>
+          <w:p>
+            <w:r>
+              <w:t>Time pressure and final consistency checks were the primary challenge. I mitigated this by prioritising high-impact verification tasks, targeted proofreading, and confirming that all dissertation claims are traceable to implemented functionality and logged weekly contributions.</w:t>
             </w:r>
           </w:p>
         </w:tc>

</xml_diff>